<commit_message>
Valida potencial de inovação e atualiza schema e amostra
</commit_message>
<xml_diff>
--- a/_SAMPLES_ENTREGAVEIS/innovation_potential_assessment/sample-innovation-potential-assessment-v1.0.0.docx
+++ b/_SAMPLES_ENTREGAVEIS/innovation_potential_assessment/sample-innovation-potential-assessment-v1.0.0.docx
@@ -262,13 +262,15 @@
         <w:tblLook w:firstColumn="1" w:firstRow="1" w:lastColumn="0" w:lastRow="0" w:noHBand="0" w:noVBand="1" w:val="04A0"/>
       </w:tblPr>
       <w:tblGrid>
-        <w:gridCol w:w="5046"/>
-        <w:gridCol w:w="5046"/>
+        <w:gridCol w:w="2523"/>
+        <w:gridCol w:w="2523"/>
+        <w:gridCol w:w="2523"/>
+        <w:gridCol w:w="2523"/>
       </w:tblGrid>
       <w:tr>
         <w:tc>
           <w:tcPr>
-            <w:tcW w:type="dxa" w:w="5046"/>
+            <w:tcW w:type="dxa" w:w="2523"/>
           </w:tcPr>
           <w:p>
             <w:r>
@@ -278,11 +280,31 @@
         </w:tc>
         <w:tc>
           <w:tcPr>
-            <w:tcW w:type="dxa" w:w="5046"/>
+            <w:tcW w:type="dxa" w:w="2523"/>
           </w:tcPr>
           <w:p>
             <w:r>
-              <w:t>Nota simulada</w:t>
+              <w:t>Nota</w:t>
+            </w:r>
+          </w:p>
+        </w:tc>
+        <w:tc>
+          <w:tcPr>
+            <w:tcW w:type="dxa" w:w="2523"/>
+          </w:tcPr>
+          <w:p>
+            <w:r>
+              <w:t>Peso</w:t>
+            </w:r>
+          </w:p>
+        </w:tc>
+        <w:tc>
+          <w:tcPr>
+            <w:tcW w:type="dxa" w:w="2523"/>
+          </w:tcPr>
+          <w:p>
+            <w:r>
+              <w:t>Justificativa</w:t>
             </w:r>
           </w:p>
         </w:tc>
@@ -290,7 +312,7 @@
       <w:tr>
         <w:tc>
           <w:tcPr>
-            <w:tcW w:type="dxa" w:w="5046"/>
+            <w:tcW w:type="dxa" w:w="2523"/>
           </w:tcPr>
           <w:p>
             <w:r>
@@ -300,7 +322,7 @@
         </w:tc>
         <w:tc>
           <w:tcPr>
-            <w:tcW w:type="dxa" w:w="5046"/>
+            <w:tcW w:type="dxa" w:w="2523"/>
           </w:tcPr>
           <w:p>
             <w:r>
@@ -308,11 +330,31 @@
             </w:r>
           </w:p>
         </w:tc>
+        <w:tc>
+          <w:tcPr>
+            <w:tcW w:type="dxa" w:w="2523"/>
+          </w:tcPr>
+          <w:p>
+            <w:r>
+              <w:t>0.3</w:t>
+            </w:r>
+          </w:p>
+        </w:tc>
+        <w:tc>
+          <w:tcPr>
+            <w:tcW w:type="dxa" w:w="2523"/>
+          </w:tcPr>
+          <w:p>
+            <w:r>
+              <w:t>Retrabalho relatado; magnitude ainda não medida (exemplo).</w:t>
+            </w:r>
+          </w:p>
+        </w:tc>
       </w:tr>
       <w:tr>
         <w:tc>
           <w:tcPr>
-            <w:tcW w:type="dxa" w:w="5046"/>
+            <w:tcW w:type="dxa" w:w="2523"/>
           </w:tcPr>
           <w:p>
             <w:r>
@@ -322,7 +364,7 @@
         </w:tc>
         <w:tc>
           <w:tcPr>
-            <w:tcW w:type="dxa" w:w="5046"/>
+            <w:tcW w:type="dxa" w:w="2523"/>
           </w:tcPr>
           <w:p>
             <w:r>
@@ -330,11 +372,31 @@
             </w:r>
           </w:p>
         </w:tc>
+        <w:tc>
+          <w:tcPr>
+            <w:tcW w:type="dxa" w:w="2523"/>
+          </w:tcPr>
+          <w:p>
+            <w:r>
+              <w:t>0.25</w:t>
+            </w:r>
+          </w:p>
+        </w:tc>
+        <w:tc>
+          <w:tcPr>
+            <w:tcW w:type="dxa" w:w="2523"/>
+          </w:tcPr>
+          <w:p>
+            <w:r>
+              <w:t>Integração, responsáveis e custo são hipóteses (exemplo).</w:t>
+            </w:r>
+          </w:p>
+        </w:tc>
       </w:tr>
       <w:tr>
         <w:tc>
           <w:tcPr>
-            <w:tcW w:type="dxa" w:w="5046"/>
+            <w:tcW w:type="dxa" w:w="2523"/>
           </w:tcPr>
           <w:p>
             <w:r>
@@ -344,7 +406,7 @@
         </w:tc>
         <w:tc>
           <w:tcPr>
-            <w:tcW w:type="dxa" w:w="5046"/>
+            <w:tcW w:type="dxa" w:w="2523"/>
           </w:tcPr>
           <w:p>
             <w:r>
@@ -352,11 +414,31 @@
             </w:r>
           </w:p>
         </w:tc>
+        <w:tc>
+          <w:tcPr>
+            <w:tcW w:type="dxa" w:w="2523"/>
+          </w:tcPr>
+          <w:p>
+            <w:r>
+              <w:t>0.2</w:t>
+            </w:r>
+          </w:p>
+        </w:tc>
+        <w:tc>
+          <w:tcPr>
+            <w:tcW w:type="dxa" w:w="2523"/>
+          </w:tcPr>
+          <w:p>
+            <w:r>
+              <w:t>Reduz esforço de atendimento (exemplo).</w:t>
+            </w:r>
+          </w:p>
+        </w:tc>
       </w:tr>
       <w:tr>
         <w:tc>
           <w:tcPr>
-            <w:tcW w:type="dxa" w:w="5046"/>
+            <w:tcW w:type="dxa" w:w="2523"/>
           </w:tcPr>
           <w:p>
             <w:r>
@@ -366,7 +448,7 @@
         </w:tc>
         <w:tc>
           <w:tcPr>
-            <w:tcW w:type="dxa" w:w="5046"/>
+            <w:tcW w:type="dxa" w:w="2523"/>
           </w:tcPr>
           <w:p>
             <w:r>
@@ -374,11 +456,31 @@
             </w:r>
           </w:p>
         </w:tc>
+        <w:tc>
+          <w:tcPr>
+            <w:tcW w:type="dxa" w:w="2523"/>
+          </w:tcPr>
+          <w:p>
+            <w:r>
+              <w:t>0.15</w:t>
+            </w:r>
+          </w:p>
+        </w:tc>
+        <w:tc>
+          <w:tcPr>
+            <w:tcW w:type="dxa" w:w="2523"/>
+          </w:tcPr>
+          <w:p>
+            <w:r>
+              <w:t>Prioridade moderada, não comprovada (exemplo).</w:t>
+            </w:r>
+          </w:p>
+        </w:tc>
       </w:tr>
       <w:tr>
         <w:tc>
           <w:tcPr>
-            <w:tcW w:type="dxa" w:w="5046"/>
+            <w:tcW w:type="dxa" w:w="2523"/>
           </w:tcPr>
           <w:p>
             <w:r>
@@ -388,11 +490,31 @@
         </w:tc>
         <w:tc>
           <w:tcPr>
-            <w:tcW w:type="dxa" w:w="5046"/>
+            <w:tcW w:type="dxa" w:w="2523"/>
           </w:tcPr>
           <w:p>
             <w:r>
               <w:t>55</w:t>
+            </w:r>
+          </w:p>
+        </w:tc>
+        <w:tc>
+          <w:tcPr>
+            <w:tcW w:type="dxa" w:w="2523"/>
+          </w:tcPr>
+          <w:p>
+            <w:r>
+              <w:t>0.1</w:t>
+            </w:r>
+          </w:p>
+        </w:tc>
+        <w:tc>
+          <w:tcPr>
+            <w:tcW w:type="dxa" w:w="2523"/>
+          </w:tcPr>
+          <w:p>
+            <w:r>
+              <w:t>Novidade relativa não comparada (exemplo).</w:t>
             </w:r>
           </w:p>
         </w:tc>

</xml_diff>

<commit_message>
Aplica o layout da sugestão ao potencial de inovação, controlado pelo Studio
A avaliação do potencial passa a seguir o layout.json do Layout Studio
em PDF e HTML: ordem dos slots, duas colunas para slots lado a lado ou
estreitos e componente pelo modo de exibição. A versão inicial do layout
segue a sugestão de 21/10: painel de notas no topo, critérios em cards
compactos de duas colunas e recomendação na caixa escura (callout), com
o título como etiqueta interna em vez da faixa azul.

O painel mostra peso em %, barra da nota, ponderado sem arredondar (a
soma fecha com o total), total e selo da classificação, ou "PENDENTE"
quando faltam. MD, TXT e DOCX passam a trazer o total e a classe, que
antes só existiam no JSON. "Fontes" não fica mais sozinho no pé da página.

Co-Authored-By: Claude Opus 5.5 <noreply@anthropic.com>
</commit_message>
<xml_diff>
--- a/_SAMPLES_ENTREGAVEIS/innovation_potential_assessment/sample-innovation-potential-assessment-v1.0.0.docx
+++ b/_SAMPLES_ENTREGAVEIS/innovation_potential_assessment/sample-innovation-potential-assessment-v1.0.0.docx
@@ -536,6 +536,11 @@
     </w:tbl>
     <w:p>
       <w:r>
+        <w:t>Total ponderado: 54.8 · Classificação: MONITORAR</w:t>
+      </w:r>
+    </w:p>
+    <w:p>
+      <w:r>
         <w:t>Fontes: FIC-02</w:t>
       </w:r>
     </w:p>

</xml_diff>